<commit_message>
Add searching notes & Elasticsearch with Python notes --no-code
</commit_message>
<xml_diff>
--- a/Elasticsearch-and-Python/Elasticsearch-and-Python-notes-01.docx
+++ b/Elasticsearch-and-Python/Elasticsearch-and-Python-notes-01.docx
@@ -1471,6 +1471,567 @@
           <w:rFonts w:ascii="Sakkal Majalla" w:hAnsi="Sakkal Majalla" w:cs="Sakkal Majalla"/>
         </w:rPr>
       </w:pPr>
+      <w:r>
+        <w:rPr>
+          <w:rFonts w:ascii="Sakkal Majalla" w:hAnsi="Sakkal Majalla" w:cs="Sakkal Majalla"/>
+        </w:rPr>
+        <w:t xml:space="preserve">Once the index is created, you can </w:t>
+      </w:r>
+      <w:r>
+        <w:rPr>
+          <w:rFonts w:ascii="Sakkal Majalla" w:hAnsi="Sakkal Majalla" w:cs="Sakkal Majalla"/>
+          <w:color w:val="BF4E14" w:themeColor="accent2" w:themeShade="BF"/>
+        </w:rPr>
+        <w:t xml:space="preserve">update its settings </w:t>
+      </w:r>
+      <w:r>
+        <w:rPr>
+          <w:rFonts w:ascii="Sakkal Majalla" w:hAnsi="Sakkal Majalla" w:cs="Sakkal Majalla"/>
+        </w:rPr>
+        <w:t xml:space="preserve">with some </w:t>
+      </w:r>
+      <w:r>
+        <w:rPr>
+          <w:rFonts w:ascii="Sakkal Majalla" w:hAnsi="Sakkal Majalla" w:cs="Sakkal Majalla"/>
+          <w:color w:val="BF4E14" w:themeColor="accent2" w:themeShade="BF"/>
+        </w:rPr>
+        <w:t>limitations</w:t>
+      </w:r>
+      <w:r>
+        <w:rPr>
+          <w:rFonts w:ascii="Sakkal Majalla" w:hAnsi="Sakkal Majalla" w:cs="Sakkal Majalla"/>
+        </w:rPr>
+        <w:t xml:space="preserve">. </w:t>
+      </w:r>
+      <w:r>
+        <w:rPr>
+          <w:rFonts w:ascii="Sakkal Majalla" w:hAnsi="Sakkal Majalla" w:cs="Sakkal Majalla"/>
+          <w:color w:val="BF4E14" w:themeColor="accent2" w:themeShade="BF"/>
+        </w:rPr>
+        <w:t>Shard count</w:t>
+      </w:r>
+      <w:r>
+        <w:rPr>
+          <w:rFonts w:ascii="Sakkal Majalla" w:hAnsi="Sakkal Majalla" w:cs="Sakkal Majalla"/>
+        </w:rPr>
+        <w:t xml:space="preserve">, for example, is </w:t>
+      </w:r>
+      <w:r>
+        <w:rPr>
+          <w:rFonts w:ascii="Sakkal Majalla" w:hAnsi="Sakkal Majalla" w:cs="Sakkal Majalla"/>
+          <w:color w:val="BF4E14" w:themeColor="accent2" w:themeShade="BF"/>
+        </w:rPr>
+        <w:t>fixed</w:t>
+      </w:r>
+      <w:r>
+        <w:rPr>
+          <w:rFonts w:ascii="Sakkal Majalla" w:hAnsi="Sakkal Majalla" w:cs="Sakkal Majalla"/>
+        </w:rPr>
+        <w:t xml:space="preserve">. But you can adjust settings like </w:t>
+      </w:r>
+      <w:r>
+        <w:rPr>
+          <w:rFonts w:ascii="Sakkal Majalla" w:hAnsi="Sakkal Majalla" w:cs="Sakkal Majalla"/>
+          <w:color w:val="BF4E14" w:themeColor="accent2" w:themeShade="BF"/>
+        </w:rPr>
+        <w:t xml:space="preserve">replica count </w:t>
+      </w:r>
+      <w:r>
+        <w:rPr>
+          <w:rFonts w:ascii="Sakkal Majalla" w:hAnsi="Sakkal Majalla" w:cs="Sakkal Majalla"/>
+        </w:rPr>
+        <w:t xml:space="preserve">or </w:t>
+      </w:r>
+      <w:r>
+        <w:rPr>
+          <w:rFonts w:ascii="Sakkal Majalla" w:hAnsi="Sakkal Majalla" w:cs="Sakkal Majalla"/>
+          <w:color w:val="BF4E14" w:themeColor="accent2" w:themeShade="BF"/>
+        </w:rPr>
+        <w:t xml:space="preserve">refresh interval </w:t>
+      </w:r>
+      <w:r>
+        <w:rPr>
+          <w:rFonts w:ascii="Sakkal Majalla" w:hAnsi="Sakkal Majalla" w:cs="Sakkal Majalla"/>
+        </w:rPr>
+        <w:t>on the fly.</w:t>
+      </w:r>
+    </w:p>
+    <w:p>
+      <w:pPr>
+        <w:ind w:left="1440" w:firstLine="720"/>
+        <w:rPr>
+          <w:rFonts w:ascii="Sakkal Majalla" w:hAnsi="Sakkal Majalla" w:cs="Sakkal Majalla"/>
+        </w:rPr>
+      </w:pPr>
+      <w:r>
+        <w:rPr>
+          <w:rFonts w:ascii="Sakkal Majalla" w:hAnsi="Sakkal Majalla" w:cs="Sakkal Majalla"/>
+        </w:rPr>
+        <w:t>===========================================================</w:t>
+      </w:r>
+    </w:p>
+    <w:p>
+      <w:pPr>
+        <w:rPr>
+          <w:rFonts w:ascii="Sakkal Majalla" w:hAnsi="Sakkal Majalla" w:cs="Sakkal Majalla"/>
+        </w:rPr>
+      </w:pPr>
+      <w:r>
+        <w:rPr>
+          <w:rFonts w:ascii="Sakkal Majalla" w:hAnsi="Sakkal Majalla" w:cs="Sakkal Majalla"/>
+        </w:rPr>
+        <w:lastRenderedPageBreak/>
+        <w:t xml:space="preserve">For </w:t>
+      </w:r>
+      <w:r>
+        <w:rPr>
+          <w:rFonts w:ascii="Sakkal Majalla" w:hAnsi="Sakkal Majalla" w:cs="Sakkal Majalla"/>
+          <w:b/>
+          <w:bCs/>
+          <w:color w:val="C00000"/>
+        </w:rPr>
+        <w:t>time</w:t>
+      </w:r>
+      <w:r>
+        <w:rPr>
+          <w:rFonts w:ascii="Sakkal Majalla" w:hAnsi="Sakkal Majalla" w:cs="Sakkal Majalla"/>
+        </w:rPr>
+        <w:t>-</w:t>
+      </w:r>
+      <w:r>
+        <w:rPr>
+          <w:rFonts w:ascii="Sakkal Majalla" w:hAnsi="Sakkal Majalla" w:cs="Sakkal Majalla"/>
+          <w:b/>
+          <w:bCs/>
+          <w:color w:val="C00000"/>
+        </w:rPr>
+        <w:t>series</w:t>
+      </w:r>
+      <w:r>
+        <w:rPr>
+          <w:rFonts w:ascii="Sakkal Majalla" w:hAnsi="Sakkal Majalla" w:cs="Sakkal Majalla"/>
+          <w:color w:val="C00000"/>
+        </w:rPr>
+        <w:t xml:space="preserve"> </w:t>
+      </w:r>
+      <w:r>
+        <w:rPr>
+          <w:rFonts w:ascii="Sakkal Majalla" w:hAnsi="Sakkal Majalla" w:cs="Sakkal Majalla"/>
+          <w:b/>
+          <w:bCs/>
+          <w:color w:val="C00000"/>
+        </w:rPr>
+        <w:t>data</w:t>
+      </w:r>
+      <w:r>
+        <w:rPr>
+          <w:rFonts w:ascii="Sakkal Majalla" w:hAnsi="Sakkal Majalla" w:cs="Sakkal Majalla"/>
+          <w:color w:val="C00000"/>
+        </w:rPr>
+        <w:t xml:space="preserve"> </w:t>
+      </w:r>
+      <w:r>
+        <w:rPr>
+          <w:rFonts w:ascii="Sakkal Majalla" w:hAnsi="Sakkal Majalla" w:cs="Sakkal Majalla"/>
+        </w:rPr>
+        <w:t xml:space="preserve">or </w:t>
+      </w:r>
+      <w:r>
+        <w:rPr>
+          <w:rFonts w:ascii="Sakkal Majalla" w:hAnsi="Sakkal Majalla" w:cs="Sakkal Majalla"/>
+          <w:b/>
+          <w:bCs/>
+          <w:color w:val="C00000"/>
+        </w:rPr>
+        <w:t>log streams</w:t>
+      </w:r>
+      <w:r>
+        <w:rPr>
+          <w:rFonts w:ascii="Sakkal Majalla" w:hAnsi="Sakkal Majalla" w:cs="Sakkal Majalla"/>
+        </w:rPr>
+        <w:t xml:space="preserve">, index templates help </w:t>
+      </w:r>
+      <w:r>
+        <w:rPr>
+          <w:rFonts w:ascii="Sakkal Majalla" w:hAnsi="Sakkal Majalla" w:cs="Sakkal Majalla"/>
+          <w:b/>
+          <w:bCs/>
+          <w:color w:val="C00000"/>
+        </w:rPr>
+        <w:t>enforce consistency</w:t>
+      </w:r>
+      <w:r>
+        <w:rPr>
+          <w:rFonts w:ascii="Sakkal Majalla" w:hAnsi="Sakkal Majalla" w:cs="Sakkal Majalla"/>
+        </w:rPr>
+        <w:t xml:space="preserve">. Templates </w:t>
+      </w:r>
+      <w:r>
+        <w:rPr>
+          <w:rFonts w:ascii="Sakkal Majalla" w:hAnsi="Sakkal Majalla" w:cs="Sakkal Majalla"/>
+          <w:b/>
+          <w:bCs/>
+          <w:color w:val="C00000"/>
+        </w:rPr>
+        <w:t>apply predefined settings</w:t>
+      </w:r>
+      <w:r>
+        <w:rPr>
+          <w:rFonts w:ascii="Sakkal Majalla" w:hAnsi="Sakkal Majalla" w:cs="Sakkal Majalla"/>
+          <w:color w:val="C00000"/>
+        </w:rPr>
+        <w:t xml:space="preserve"> </w:t>
+      </w:r>
+      <w:r>
+        <w:rPr>
+          <w:rFonts w:ascii="Sakkal Majalla" w:hAnsi="Sakkal Majalla" w:cs="Sakkal Majalla"/>
+        </w:rPr>
+        <w:t xml:space="preserve">and mappings to all indexes that match a naming pattern, making it easier to manage </w:t>
+      </w:r>
+      <w:r>
+        <w:rPr>
+          <w:rFonts w:ascii="Sakkal Majalla" w:hAnsi="Sakkal Majalla" w:cs="Sakkal Majalla"/>
+          <w:b/>
+          <w:bCs/>
+          <w:color w:val="C00000"/>
+        </w:rPr>
+        <w:t>rolling indexes</w:t>
+      </w:r>
+      <w:r>
+        <w:rPr>
+          <w:rFonts w:ascii="Sakkal Majalla" w:hAnsi="Sakkal Majalla" w:cs="Sakkal Majalla"/>
+        </w:rPr>
+        <w:t>.</w:t>
+      </w:r>
+    </w:p>
+    <w:p>
+      <w:pPr>
+        <w:ind w:left="1440" w:firstLine="720"/>
+        <w:rPr>
+          <w:rFonts w:ascii="Sakkal Majalla" w:hAnsi="Sakkal Majalla" w:cs="Sakkal Majalla"/>
+        </w:rPr>
+      </w:pPr>
+      <w:r>
+        <w:rPr>
+          <w:rFonts w:ascii="Sakkal Majalla" w:hAnsi="Sakkal Majalla" w:cs="Sakkal Majalla"/>
+        </w:rPr>
+        <w:t>===========================================================</w:t>
+      </w:r>
+    </w:p>
+    <w:p>
+      <w:pPr>
+        <w:rPr>
+          <w:rFonts w:ascii="Sakkal Majalla" w:hAnsi="Sakkal Majalla" w:cs="Sakkal Majalla"/>
+          <w:b/>
+          <w:bCs/>
+          <w:color w:val="A6A6A6" w:themeColor="background1" w:themeShade="A6"/>
+        </w:rPr>
+      </w:pPr>
+      <w:r>
+        <w:rPr>
+          <w:rFonts w:ascii="Sakkal Majalla" w:hAnsi="Sakkal Majalla" w:cs="Sakkal Majalla"/>
+          <w:b/>
+          <w:bCs/>
+          <w:color w:val="A6A6A6" w:themeColor="background1" w:themeShade="A6"/>
+        </w:rPr>
+        <w:t>Define Mappings for Your Data</w:t>
+      </w:r>
+    </w:p>
+    <w:p>
+      <w:pPr>
+        <w:rPr>
+          <w:rFonts w:ascii="Sakkal Majalla" w:hAnsi="Sakkal Majalla" w:cs="Sakkal Majalla"/>
+        </w:rPr>
+      </w:pPr>
+      <w:r>
+        <w:rPr>
+          <w:rFonts w:ascii="Sakkal Majalla" w:hAnsi="Sakkal Majalla" w:cs="Sakkal Majalla"/>
+        </w:rPr>
+        <w:t xml:space="preserve">Mappings define the structure of your </w:t>
+      </w:r>
+      <w:r>
+        <w:rPr>
+          <w:rFonts w:ascii="Sakkal Majalla" w:hAnsi="Sakkal Majalla" w:cs="Sakkal Majalla"/>
+          <w:color w:val="0B769F" w:themeColor="accent4" w:themeShade="BF"/>
+        </w:rPr>
+        <w:t>documents</w:t>
+      </w:r>
+      <w:r>
+        <w:rPr>
+          <w:rFonts w:ascii="Sakkal Majalla" w:hAnsi="Sakkal Majalla" w:cs="Sakkal Majalla"/>
+        </w:rPr>
+        <w:t xml:space="preserve">, </w:t>
+      </w:r>
+      <w:r>
+        <w:rPr>
+          <w:rFonts w:ascii="Sakkal Majalla" w:hAnsi="Sakkal Majalla" w:cs="Sakkal Majalla"/>
+          <w:color w:val="0B769F" w:themeColor="accent4" w:themeShade="BF"/>
+        </w:rPr>
+        <w:t>which fields exist</w:t>
+      </w:r>
+      <w:r>
+        <w:rPr>
+          <w:rFonts w:ascii="Sakkal Majalla" w:hAnsi="Sakkal Majalla" w:cs="Sakkal Majalla"/>
+        </w:rPr>
+        <w:t xml:space="preserve">, </w:t>
+      </w:r>
+      <w:r>
+        <w:rPr>
+          <w:rFonts w:ascii="Sakkal Majalla" w:hAnsi="Sakkal Majalla" w:cs="Sakkal Majalla"/>
+          <w:color w:val="0B769F" w:themeColor="accent4" w:themeShade="BF"/>
+        </w:rPr>
+        <w:t>what types they use</w:t>
+      </w:r>
+      <w:r>
+        <w:rPr>
+          <w:rFonts w:ascii="Sakkal Majalla" w:hAnsi="Sakkal Majalla" w:cs="Sakkal Majalla"/>
+        </w:rPr>
+        <w:t xml:space="preserve">, </w:t>
+      </w:r>
+      <w:r>
+        <w:rPr>
+          <w:rFonts w:ascii="Sakkal Majalla" w:hAnsi="Sakkal Majalla" w:cs="Sakkal Majalla"/>
+          <w:color w:val="0B769F" w:themeColor="accent4" w:themeShade="BF"/>
+        </w:rPr>
+        <w:t>how they’re indexed</w:t>
+      </w:r>
+      <w:r>
+        <w:rPr>
+          <w:rFonts w:ascii="Sakkal Majalla" w:hAnsi="Sakkal Majalla" w:cs="Sakkal Majalla"/>
+        </w:rPr>
+        <w:t xml:space="preserve">, and </w:t>
+      </w:r>
+      <w:r>
+        <w:rPr>
+          <w:rFonts w:ascii="Sakkal Majalla" w:hAnsi="Sakkal Majalla" w:cs="Sakkal Majalla"/>
+          <w:color w:val="0B769F" w:themeColor="accent4" w:themeShade="BF"/>
+        </w:rPr>
+        <w:t>how they’re analyzed</w:t>
+      </w:r>
+      <w:r>
+        <w:rPr>
+          <w:rFonts w:ascii="Sakkal Majalla" w:hAnsi="Sakkal Majalla" w:cs="Sakkal Majalla"/>
+        </w:rPr>
+        <w:t xml:space="preserve">. While Elasticsearch can </w:t>
+      </w:r>
+      <w:r>
+        <w:rPr>
+          <w:rFonts w:ascii="Sakkal Majalla" w:hAnsi="Sakkal Majalla" w:cs="Sakkal Majalla"/>
+          <w:color w:val="0B769F" w:themeColor="accent4" w:themeShade="BF"/>
+        </w:rPr>
+        <w:t>infer types automatically</w:t>
+      </w:r>
+      <w:r>
+        <w:rPr>
+          <w:rFonts w:ascii="Sakkal Majalla" w:hAnsi="Sakkal Majalla" w:cs="Sakkal Majalla"/>
+        </w:rPr>
+        <w:t xml:space="preserve">, explicit mappings </w:t>
+      </w:r>
+      <w:r>
+        <w:rPr>
+          <w:rFonts w:ascii="Sakkal Majalla" w:hAnsi="Sakkal Majalla" w:cs="Sakkal Majalla"/>
+          <w:color w:val="0B769F" w:themeColor="accent4" w:themeShade="BF"/>
+        </w:rPr>
+        <w:t xml:space="preserve">prevent </w:t>
+      </w:r>
+      <w:r>
+        <w:rPr>
+          <w:rFonts w:ascii="Sakkal Majalla" w:hAnsi="Sakkal Majalla" w:cs="Sakkal Majalla"/>
+        </w:rPr>
+        <w:t>surprises and offer better control.</w:t>
+      </w:r>
+    </w:p>
+    <w:p>
+      <w:pPr>
+        <w:rPr>
+          <w:rFonts w:ascii="Sakkal Majalla" w:hAnsi="Sakkal Majalla" w:cs="Sakkal Majalla"/>
+        </w:rPr>
+      </w:pPr>
+      <w:r>
+        <w:rPr>
+          <w:rFonts w:ascii="Sakkal Majalla" w:hAnsi="Sakkal Majalla" w:cs="Sakkal Majalla"/>
+        </w:rPr>
+        <w:t xml:space="preserve">Field types matter. Use </w:t>
+      </w:r>
+      <w:r>
+        <w:rPr>
+          <w:rFonts w:ascii="Sakkal Majalla" w:hAnsi="Sakkal Majalla" w:cs="Sakkal Majalla"/>
+          <w:color w:val="0B769F" w:themeColor="accent4" w:themeShade="BF"/>
+        </w:rPr>
+        <w:t xml:space="preserve">text </w:t>
+      </w:r>
+      <w:r>
+        <w:rPr>
+          <w:rFonts w:ascii="Sakkal Majalla" w:hAnsi="Sakkal Majalla" w:cs="Sakkal Majalla"/>
+        </w:rPr>
+        <w:t xml:space="preserve">for full-text search, </w:t>
+      </w:r>
+      <w:r>
+        <w:rPr>
+          <w:rFonts w:ascii="Sakkal Majalla" w:hAnsi="Sakkal Majalla" w:cs="Sakkal Majalla"/>
+          <w:color w:val="0B769F" w:themeColor="accent4" w:themeShade="BF"/>
+        </w:rPr>
+        <w:t xml:space="preserve">keyword </w:t>
+      </w:r>
+      <w:r>
+        <w:rPr>
+          <w:rFonts w:ascii="Sakkal Majalla" w:hAnsi="Sakkal Majalla" w:cs="Sakkal Majalla"/>
+        </w:rPr>
+        <w:t xml:space="preserve">for exact matches and aggregations, </w:t>
+      </w:r>
+      <w:r>
+        <w:rPr>
+          <w:rFonts w:ascii="Sakkal Majalla" w:hAnsi="Sakkal Majalla" w:cs="Sakkal Majalla"/>
+          <w:color w:val="0B769F" w:themeColor="accent4" w:themeShade="BF"/>
+        </w:rPr>
+        <w:t xml:space="preserve">integer </w:t>
+      </w:r>
+      <w:r>
+        <w:rPr>
+          <w:rFonts w:ascii="Sakkal Majalla" w:hAnsi="Sakkal Majalla" w:cs="Sakkal Majalla"/>
+        </w:rPr>
+        <w:t xml:space="preserve">for numeric operations, and </w:t>
+      </w:r>
+      <w:r>
+        <w:rPr>
+          <w:rFonts w:ascii="Sakkal Majalla" w:hAnsi="Sakkal Majalla" w:cs="Sakkal Majalla"/>
+          <w:color w:val="0B769F" w:themeColor="accent4" w:themeShade="BF"/>
+        </w:rPr>
+        <w:t xml:space="preserve">date </w:t>
+      </w:r>
+      <w:r>
+        <w:rPr>
+          <w:rFonts w:ascii="Sakkal Majalla" w:hAnsi="Sakkal Majalla" w:cs="Sakkal Majalla"/>
+        </w:rPr>
+        <w:t>for anything temporal.</w:t>
+      </w:r>
+    </w:p>
+    <w:p>
+      <w:pPr>
+        <w:ind w:left="1440" w:firstLine="720"/>
+        <w:rPr>
+          <w:rFonts w:ascii="Sakkal Majalla" w:hAnsi="Sakkal Majalla" w:cs="Sakkal Majalla"/>
+        </w:rPr>
+      </w:pPr>
+      <w:r>
+        <w:rPr>
+          <w:rFonts w:ascii="Sakkal Majalla" w:hAnsi="Sakkal Majalla" w:cs="Sakkal Majalla"/>
+        </w:rPr>
+        <w:t>===========================================================</w:t>
+      </w:r>
+    </w:p>
+    <w:p>
+      <w:pPr>
+        <w:rPr>
+          <w:rFonts w:ascii="Sakkal Majalla" w:hAnsi="Sakkal Majalla" w:cs="Sakkal Majalla"/>
+        </w:rPr>
+      </w:pPr>
+      <w:r>
+        <w:rPr>
+          <w:rFonts w:ascii="Sakkal Majalla" w:hAnsi="Sakkal Majalla" w:cs="Sakkal Majalla"/>
+          <w:color w:val="A6A6A6" w:themeColor="background1" w:themeShade="A6"/>
+        </w:rPr>
+        <w:t xml:space="preserve">Multi-field </w:t>
+      </w:r>
+      <w:r>
+        <w:rPr>
+          <w:rFonts w:ascii="Sakkal Majalla" w:hAnsi="Sakkal Majalla" w:cs="Sakkal Majalla"/>
+        </w:rPr>
+        <w:t xml:space="preserve">mappings are especially useful when you want to </w:t>
+      </w:r>
+      <w:r>
+        <w:rPr>
+          <w:rFonts w:ascii="Sakkal Majalla" w:hAnsi="Sakkal Majalla" w:cs="Sakkal Majalla"/>
+          <w:color w:val="A6A6A6" w:themeColor="background1" w:themeShade="A6"/>
+        </w:rPr>
+        <w:t xml:space="preserve">support different types of queries </w:t>
+      </w:r>
+      <w:r>
+        <w:rPr>
+          <w:rFonts w:ascii="Sakkal Majalla" w:hAnsi="Sakkal Majalla" w:cs="Sakkal Majalla"/>
+        </w:rPr>
+        <w:t xml:space="preserve">on the same field. A text field can include a </w:t>
+      </w:r>
+      <w:r>
+        <w:rPr>
+          <w:rFonts w:ascii="Sakkal Majalla" w:hAnsi="Sakkal Majalla" w:cs="Sakkal Majalla"/>
+          <w:color w:val="A6A6A6" w:themeColor="background1" w:themeShade="A6"/>
+        </w:rPr>
+        <w:t xml:space="preserve">keyword sub-field </w:t>
+      </w:r>
+      <w:r>
+        <w:rPr>
+          <w:rFonts w:ascii="Sakkal Majalla" w:hAnsi="Sakkal Majalla" w:cs="Sakkal Majalla"/>
+        </w:rPr>
+        <w:t xml:space="preserve">to enable both </w:t>
+      </w:r>
+      <w:r>
+        <w:rPr>
+          <w:rFonts w:ascii="Sakkal Majalla" w:hAnsi="Sakkal Majalla" w:cs="Sakkal Majalla"/>
+          <w:color w:val="A6A6A6" w:themeColor="background1" w:themeShade="A6"/>
+        </w:rPr>
+        <w:t xml:space="preserve">full-text search </w:t>
+      </w:r>
+      <w:r>
+        <w:rPr>
+          <w:rFonts w:ascii="Sakkal Majalla" w:hAnsi="Sakkal Majalla" w:cs="Sakkal Majalla"/>
+        </w:rPr>
+        <w:t xml:space="preserve">and </w:t>
+      </w:r>
+      <w:r>
+        <w:rPr>
+          <w:rFonts w:ascii="Sakkal Majalla" w:hAnsi="Sakkal Majalla" w:cs="Sakkal Majalla"/>
+          <w:color w:val="A6A6A6" w:themeColor="background1" w:themeShade="A6"/>
+        </w:rPr>
+        <w:t>exact filtering</w:t>
+      </w:r>
+      <w:r>
+        <w:rPr>
+          <w:rFonts w:ascii="Sakkal Majalla" w:hAnsi="Sakkal Majalla" w:cs="Sakkal Majalla"/>
+        </w:rPr>
+        <w:t>.</w:t>
+      </w:r>
+    </w:p>
+    <w:p>
+      <w:pPr>
+        <w:ind w:left="1440" w:firstLine="720"/>
+        <w:rPr>
+          <w:rFonts w:ascii="Sakkal Majalla" w:hAnsi="Sakkal Majalla" w:cs="Sakkal Majalla"/>
+        </w:rPr>
+      </w:pPr>
+      <w:r>
+        <w:rPr>
+          <w:rFonts w:ascii="Sakkal Majalla" w:hAnsi="Sakkal Majalla" w:cs="Sakkal Majalla"/>
+        </w:rPr>
+        <w:t>===========================================================</w:t>
+      </w:r>
+    </w:p>
+    <w:p>
+      <w:pPr>
+        <w:rPr>
+          <w:rFonts w:ascii="Sakkal Majalla" w:hAnsi="Sakkal Majalla" w:cs="Sakkal Majalla"/>
+        </w:rPr>
+      </w:pPr>
+      <w:r>
+        <w:rPr>
+          <w:rFonts w:ascii="Sakkal Majalla" w:hAnsi="Sakkal Majalla" w:cs="Sakkal Majalla"/>
+        </w:rPr>
+        <w:t>If your schema evolves, dynamic templates help assign field types automatically based on naming patterns, useful when field names aren’t known in advance.</w:t>
+      </w:r>
+    </w:p>
+    <w:p>
+      <w:pPr>
+        <w:ind w:left="1440" w:firstLine="720"/>
+        <w:rPr>
+          <w:rFonts w:ascii="Sakkal Majalla" w:hAnsi="Sakkal Majalla" w:cs="Sakkal Majalla"/>
+        </w:rPr>
+      </w:pPr>
+      <w:r>
+        <w:rPr>
+          <w:rFonts w:ascii="Sakkal Majalla" w:hAnsi="Sakkal Majalla" w:cs="Sakkal Majalla"/>
+        </w:rPr>
+        <w:t>===========================================================</w:t>
+      </w:r>
     </w:p>
     <w:p>
       <w:pPr>
@@ -2502,7 +3063,7 @@
   <w:style w:type="paragraph" w:default="1" w:styleId="Normal">
     <w:name w:val="Normal"/>
     <w:qFormat/>
-    <w:rsid w:val="004836F1"/>
+    <w:rsid w:val="00016FFF"/>
   </w:style>
   <w:style w:type="paragraph" w:styleId="Heading1">
     <w:name w:val="heading 1"/>

</xml_diff>